<commit_message>
added server script and game assets
</commit_message>
<xml_diff>
--- a/docs/versions.docx
+++ b/docs/versions.docx
@@ -36,6 +36,14 @@
           <w:lang w:val="en-US"/>
         </w:rPr>
       </w:pPr>
+      <w:r>
+        <w:rPr>
+          <w:lang w:val="en-US"/>
+        </w:rPr>
+        <w:t>Basic web application from scratch</w:t>
+      </w:r>
+      <w:bookmarkStart w:id="0" w:name="_GoBack"/>
+      <w:bookmarkEnd w:id="0"/>
     </w:p>
     <w:p>
       <w:pPr>
@@ -43,8 +51,6 @@
           <w:lang w:val="en-US"/>
         </w:rPr>
       </w:pPr>
-      <w:bookmarkStart w:id="0" w:name="_GoBack"/>
-      <w:bookmarkEnd w:id="0"/>
     </w:p>
     <w:sectPr>
       <w:pgSz w:w="11906" w:h="16838"/>

</xml_diff>